<commit_message>
Updated manuscript supplemental with the new plots and updated operation protocol
</commit_message>
<xml_diff>
--- a/Manuscript Supplemental/System Operation.docx
+++ b/Manuscript Supplemental/System Operation.docx
@@ -1,6 +1,6 @@
 
 <file path=word/document.xml><?xml version="1.0" encoding="utf-8"?>
-<w:document xmlns:wpc="http://schemas.microsoft.com/office/word/2010/wordprocessingCanvas" xmlns:cx="http://schemas.microsoft.com/office/drawing/2014/chartex" xmlns:cx1="http://schemas.microsoft.com/office/drawing/2015/9/8/chartex" xmlns:cx2="http://schemas.microsoft.com/office/drawing/2015/10/21/chartex" xmlns:cx3="http://schemas.microsoft.com/office/drawing/2016/5/9/chartex" xmlns:cx4="http://schemas.microsoft.com/office/drawing/2016/5/10/chartex" xmlns:cx5="http://schemas.microsoft.com/office/drawing/2016/5/11/chartex" xmlns:cx6="http://schemas.microsoft.com/office/drawing/2016/5/12/chartex" xmlns:cx7="http://schemas.microsoft.com/office/drawing/2016/5/13/chartex" xmlns:cx8="http://schemas.microsoft.com/office/drawing/2016/5/14/chartex" xmlns:mc="http://schemas.openxmlformats.org/markup-compatibility/2006" xmlns:aink="http://schemas.microsoft.com/office/drawing/2016/ink" xmlns:am3d="http://schemas.microsoft.com/office/drawing/2017/model3d" xmlns:o="urn:schemas-microsoft-com:office:office" xmlns:oel="http://schemas.microsoft.com/office/2019/extlst" xmlns:r="http://schemas.openxmlformats.org/officeDocument/2006/relationships" xmlns:m="http://schemas.openxmlformats.org/officeDocument/2006/math" xmlns:v="urn:schemas-microsoft-com:vml" xmlns:wp14="http://schemas.microsoft.com/office/word/2010/wordprocessingDrawing" xmlns:wp="http://schemas.openxmlformats.org/drawingml/2006/wordprocessingDrawing" xmlns:w10="urn:schemas-microsoft-com:office:word" xmlns:w="http://schemas.openxmlformats.org/wordprocessingml/2006/main" xmlns:w14="http://schemas.microsoft.com/office/word/2010/wordml" xmlns:w15="http://schemas.microsoft.com/office/word/2012/wordml" xmlns:w16cex="http://schemas.microsoft.com/office/word/2018/wordml/cex" xmlns:w16cid="http://schemas.microsoft.com/office/word/2016/wordml/cid" xmlns:w16="http://schemas.microsoft.com/office/word/2018/wordml" xmlns:w16du="http://schemas.microsoft.com/office/word/2023/wordml/word16du" xmlns:w16sdtdh="http://schemas.microsoft.com/office/word/2020/wordml/sdtdatahash" xmlns:w16sdtfl="http://schemas.microsoft.com/office/word/2024/wordml/sdtformatlock" xmlns:w16se="http://schemas.microsoft.com/office/word/2015/wordml/symex" xmlns:wpg="http://schemas.microsoft.com/office/word/2010/wordprocessingGroup" xmlns:wpi="http://schemas.microsoft.com/office/word/2010/wordprocessingInk" xmlns:wne="http://schemas.microsoft.com/office/word/2006/wordml" xmlns:wps="http://schemas.microsoft.com/office/word/2010/wordprocessingShape" mc:Ignorable="w14 w15 w16se w16cid w16 w16cex w16sdtdh w16sdtfl w16du wp14">
+<w:document xmlns:wpc="http://schemas.microsoft.com/office/word/2010/wordprocessingCanvas" xmlns:cx="http://schemas.microsoft.com/office/drawing/2014/chartex" xmlns:cx1="http://schemas.microsoft.com/office/drawing/2015/9/8/chartex" xmlns:cx2="http://schemas.microsoft.com/office/drawing/2015/10/21/chartex" xmlns:cx3="http://schemas.microsoft.com/office/drawing/2016/5/9/chartex" xmlns:cx4="http://schemas.microsoft.com/office/drawing/2016/5/10/chartex" xmlns:cx5="http://schemas.microsoft.com/office/drawing/2016/5/11/chartex" xmlns:cx6="http://schemas.microsoft.com/office/drawing/2016/5/12/chartex" xmlns:cx7="http://schemas.microsoft.com/office/drawing/2016/5/13/chartex" xmlns:cx8="http://schemas.microsoft.com/office/drawing/2016/5/14/chartex" xmlns:mc="http://schemas.openxmlformats.org/markup-compatibility/2006" xmlns:m="http://schemas.openxmlformats.org/officeDocument/2006/math" xmlns:aink="http://schemas.microsoft.com/office/drawing/2016/ink" xmlns:am3d="http://schemas.microsoft.com/office/drawing/2017/model3d" xmlns:oel="http://schemas.microsoft.com/office/2019/extlst" xmlns:r="http://schemas.openxmlformats.org/officeDocument/2006/relationships" xmlns:wp14="http://schemas.microsoft.com/office/word/2010/wordprocessingDrawing" xmlns:wp="http://schemas.openxmlformats.org/drawingml/2006/wordprocessingDrawing" xmlns:wpg="http://schemas.microsoft.com/office/word/2010/wordprocessingGroup" xmlns:wpi="http://schemas.microsoft.com/office/word/2010/wordprocessingInk" xmlns:wps="http://schemas.microsoft.com/office/word/2010/wordprocessingShape" xmlns:o="urn:schemas-microsoft-com:office:office" xmlns:v="urn:schemas-microsoft-com:vml" xmlns:w10="urn:schemas-microsoft-com:office:word" xmlns:w="http://schemas.openxmlformats.org/wordprocessingml/2006/main" xmlns:w14="http://schemas.microsoft.com/office/word/2010/wordml" xmlns:w15="http://schemas.microsoft.com/office/word/2012/wordml" xmlns:w16cei="http://schemas.microsoft.com/office/word/2026/wordml/cei" xmlns:w16cex="http://schemas.microsoft.com/office/word/2018/wordml/cex" xmlns:w16cid="http://schemas.microsoft.com/office/word/2016/wordml/cid" xmlns:w16="http://schemas.microsoft.com/office/word/2018/wordml" xmlns:w16sdtdh="http://schemas.microsoft.com/office/word/2020/wordml/sdtdatahash" xmlns:w16sdtfl="http://schemas.microsoft.com/office/word/2024/wordml/sdtformatlock" xmlns:w16se="http://schemas.microsoft.com/office/word/2015/wordml/symex" xmlns:w16du="http://schemas.microsoft.com/office/word/2023/wordml/word16du" xmlns:wne="http://schemas.microsoft.com/office/word/2006/wordml" mc:Ignorable="w14 w15 w16se w16cid w16 w16cex w16sdtdh w16sdtfl w16du wp14">
   <w:body>
     <w:p>
       <w:pPr>
@@ -14,7 +14,15 @@
     </w:p>
     <w:p>
       <w:r>
-        <w:t>This section reproduces the Timme Lab CLiQR protocol document, including detailed instructions about system operation.</w:t>
+        <w:t xml:space="preserve">This section reproduces the Timme Lab </w:t>
+      </w:r>
+      <w:proofErr w:type="spellStart"/>
+      <w:r>
+        <w:t>CLiQR</w:t>
+      </w:r>
+      <w:proofErr w:type="spellEnd"/>
+      <w:r>
+        <w:t xml:space="preserve"> protocol document, including detailed instructions about system operation.</w:t>
       </w:r>
     </w:p>
     <w:p>
@@ -41,7 +49,13 @@
         <w:rPr>
           <w:rFonts w:eastAsiaTheme="minorEastAsia"/>
         </w:rPr>
-        <w:t>9 February 2026</w:t>
+        <w:t>14 August</w:t>
+      </w:r>
+      <w:r>
+        <w:rPr>
+          <w:rFonts w:eastAsiaTheme="minorEastAsia"/>
+        </w:rPr>
+        <w:t xml:space="preserve"> 2026</w:t>
       </w:r>
       <w:r>
         <w:rPr>
@@ -53,7 +67,21 @@
         <w:rPr>
           <w:rFonts w:eastAsiaTheme="minorEastAsia"/>
         </w:rPr>
-        <w:t>the CLiQR GUI (</w:t>
+        <w:t xml:space="preserve">the </w:t>
+      </w:r>
+      <w:proofErr w:type="spellStart"/>
+      <w:r>
+        <w:rPr>
+          <w:rFonts w:eastAsiaTheme="minorEastAsia"/>
+        </w:rPr>
+        <w:t>CLiQR</w:t>
+      </w:r>
+      <w:proofErr w:type="spellEnd"/>
+      <w:r>
+        <w:rPr>
+          <w:rFonts w:eastAsiaTheme="minorEastAsia"/>
+        </w:rPr>
+        <w:t xml:space="preserve"> GUI (</w:t>
       </w:r>
       <w:hyperlink r:id="rId5" w:history="1">
         <w:r>
@@ -242,8 +270,16 @@
         <w:rPr>
           <w:rFonts w:eastAsiaTheme="minorEastAsia"/>
         </w:rPr>
-        <w:t>If the animals had their weights previously recorded the same day (e.g. before forced swim testing in the morning), you can simply record those weights in the UI and skip the scale+beaker</w:t>
-      </w:r>
+        <w:t xml:space="preserve">If the animals had their weights previously recorded the same day (e.g. before forced swim testing in the morning), you can simply record those weights in the UI and skip the </w:t>
+      </w:r>
+      <w:proofErr w:type="spellStart"/>
+      <w:r>
+        <w:rPr>
+          <w:rFonts w:eastAsiaTheme="minorEastAsia"/>
+        </w:rPr>
+        <w:t>scale+beaker</w:t>
+      </w:r>
+      <w:proofErr w:type="spellEnd"/>
     </w:p>
     <w:p>
       <w:pPr>
@@ -454,19 +490,27 @@
         <w:rPr>
           <w:rFonts w:eastAsiaTheme="minorEastAsia"/>
         </w:rPr>
-        <w:t>Power on the computer (if necessary) and log in to the TimmeLab account (</w:t>
-      </w:r>
-      <w:r>
-        <w:rPr>
-          <w:rFonts w:eastAsiaTheme="minorEastAsia"/>
-        </w:rPr>
-        <w:t>or whatever account your lab has created for the purpose!</w:t>
-      </w:r>
-      <w:r>
-        <w:rPr>
-          <w:rFonts w:eastAsiaTheme="minorEastAsia"/>
-        </w:rPr>
-        <w:t>)</w:t>
+        <w:t xml:space="preserve">Power on the computer (if necessary) and log in to the </w:t>
+      </w:r>
+      <w:proofErr w:type="spellStart"/>
+      <w:r>
+        <w:rPr>
+          <w:rFonts w:eastAsiaTheme="minorEastAsia"/>
+        </w:rPr>
+        <w:t>TimmeLab</w:t>
+      </w:r>
+      <w:proofErr w:type="spellEnd"/>
+      <w:r>
+        <w:rPr>
+          <w:rFonts w:eastAsiaTheme="minorEastAsia"/>
+        </w:rPr>
+        <w:t xml:space="preserve"> account </w:t>
+      </w:r>
+      <w:r>
+        <w:rPr>
+          <w:rFonts w:eastAsiaTheme="minorEastAsia"/>
+        </w:rPr>
+        <w:t>(ask if you don’t know the password)</w:t>
       </w:r>
     </w:p>
     <w:p>
@@ -487,12 +531,14 @@
         </w:rPr>
         <w:t>Double-click on the desktop shortcut with the name “</w:t>
       </w:r>
+      <w:proofErr w:type="spellStart"/>
       <w:r>
         <w:rPr>
           <w:rFonts w:eastAsiaTheme="minorEastAsia"/>
         </w:rPr>
         <w:t>CLiQR</w:t>
       </w:r>
+      <w:proofErr w:type="spellEnd"/>
       <w:r>
         <w:rPr>
           <w:rFonts w:eastAsiaTheme="minorEastAsia"/>
@@ -556,7 +602,7 @@
           <w:noProof/>
         </w:rPr>
         <w:drawing>
-          <wp:inline distT="0" distB="0" distL="0" distR="0" wp14:anchorId="03A4A389" wp14:editId="346B5D5D">
+          <wp:inline distT="0" distB="0" distL="0" distR="0" wp14:anchorId="03A4A389" wp14:editId="40713CB6">
             <wp:extent cx="5943600" cy="2950845"/>
             <wp:effectExtent l="0" t="0" r="0" b="0"/>
             <wp:docPr id="1382549553" name="Picture 1" descr="A screenshot of a computer&#10;&#10;AI-generated content may be incorrect."/>
@@ -610,7 +656,15 @@
         </w:rPr>
       </w:pPr>
       <w:r>
-        <w:t>Figure S18. Initial CLiQR GUI Window Appearance</w:t>
+        <w:t xml:space="preserve">Figure S18. Initial </w:t>
+      </w:r>
+      <w:proofErr w:type="spellStart"/>
+      <w:r>
+        <w:t>CLiQR</w:t>
+      </w:r>
+      <w:proofErr w:type="spellEnd"/>
+      <w:r>
+        <w:t xml:space="preserve"> GUI Window Appearance</w:t>
       </w:r>
     </w:p>
     <w:p>
@@ -627,7 +681,21 @@
         <w:rPr>
           <w:rFonts w:eastAsiaTheme="minorEastAsia"/>
         </w:rPr>
-        <w:t xml:space="preserve">Begin by pressing the “Initialize Hardware” button, and the system will detect and configure all of the capacitive sensors. The resulting window should look like </w:t>
+        <w:t xml:space="preserve">Begin by pressing the “Initialize Hardware” button, and the system will detect and configure </w:t>
+      </w:r>
+      <w:proofErr w:type="gramStart"/>
+      <w:r>
+        <w:rPr>
+          <w:rFonts w:eastAsiaTheme="minorEastAsia"/>
+        </w:rPr>
+        <w:t>all of</w:t>
+      </w:r>
+      <w:proofErr w:type="gramEnd"/>
+      <w:r>
+        <w:rPr>
+          <w:rFonts w:eastAsiaTheme="minorEastAsia"/>
+        </w:rPr>
+        <w:t xml:space="preserve"> the capacitive sensors. The resulting window should look like </w:t>
       </w:r>
       <w:r>
         <w:rPr>
@@ -652,7 +720,7 @@
           <w:noProof/>
         </w:rPr>
         <w:drawing>
-          <wp:inline distT="0" distB="0" distL="0" distR="0" wp14:anchorId="67F08A4D" wp14:editId="002F5F65">
+          <wp:inline distT="0" distB="0" distL="0" distR="0" wp14:anchorId="67F08A4D" wp14:editId="2DEB8C47">
             <wp:extent cx="5943600" cy="2898775"/>
             <wp:effectExtent l="0" t="0" r="0" b="0"/>
             <wp:docPr id="1924234876" name="Picture 2" descr="A screenshot of a chat&#10;&#10;AI-generated content may be incorrect."/>
@@ -704,7 +772,23 @@
         </w:rPr>
       </w:pPr>
       <w:r>
-        <w:t>Figure S19. CLiQR GUI after hardware initialization. Notice that all 4 FT232H boards are listed, along with the sensors each controls.</w:t>
+        <w:t xml:space="preserve">Figure S19. </w:t>
+      </w:r>
+      <w:proofErr w:type="spellStart"/>
+      <w:r>
+        <w:t>CLiQR</w:t>
+      </w:r>
+      <w:proofErr w:type="spellEnd"/>
+      <w:r>
+        <w:t xml:space="preserve"> GUI after hardware initialization. Notice that all 4 FT232H boards are listed, along with the sensors each </w:t>
+      </w:r>
+      <w:proofErr w:type="gramStart"/>
+      <w:r>
+        <w:t>controls</w:t>
+      </w:r>
+      <w:proofErr w:type="gramEnd"/>
+      <w:r>
+        <w:t>.</w:t>
       </w:r>
     </w:p>
     <w:p>
@@ -723,7 +807,21 @@
         <w:rPr>
           <w:rFonts w:eastAsiaTheme="minorEastAsia"/>
         </w:rPr>
-        <w:t>The “Output Directory” text entry box defaults to “Lickometry Data” (a subdirectory inside the CLiQR directory, just for storing data recordings)</w:t>
+        <w:t xml:space="preserve">The “Output Directory” text entry box defaults to “Lickometry Data” (a subdirectory inside the </w:t>
+      </w:r>
+      <w:proofErr w:type="spellStart"/>
+      <w:r>
+        <w:rPr>
+          <w:rFonts w:eastAsiaTheme="minorEastAsia"/>
+        </w:rPr>
+        <w:t>CLiQR</w:t>
+      </w:r>
+      <w:proofErr w:type="spellEnd"/>
+      <w:r>
+        <w:rPr>
+          <w:rFonts w:eastAsiaTheme="minorEastAsia"/>
+        </w:rPr>
+        <w:t xml:space="preserve"> directory, just for storing data recordings)</w:t>
       </w:r>
     </w:p>
     <w:p>
@@ -799,7 +897,35 @@
         <w:rPr>
           <w:rFonts w:eastAsiaTheme="minorEastAsia"/>
         </w:rPr>
-        <w:t>The format should be sensor_number, animal_id and each sensor should be on a new line.</w:t>
+        <w:t xml:space="preserve">The format should be </w:t>
+      </w:r>
+      <w:proofErr w:type="spellStart"/>
+      <w:r>
+        <w:rPr>
+          <w:rFonts w:eastAsiaTheme="minorEastAsia"/>
+        </w:rPr>
+        <w:t>sensor_number</w:t>
+      </w:r>
+      <w:proofErr w:type="spellEnd"/>
+      <w:r>
+        <w:rPr>
+          <w:rFonts w:eastAsiaTheme="minorEastAsia"/>
+        </w:rPr>
+        <w:t xml:space="preserve">, </w:t>
+      </w:r>
+      <w:proofErr w:type="spellStart"/>
+      <w:r>
+        <w:rPr>
+          <w:rFonts w:eastAsiaTheme="minorEastAsia"/>
+        </w:rPr>
+        <w:t>animal_id</w:t>
+      </w:r>
+      <w:proofErr w:type="spellEnd"/>
+      <w:r>
+        <w:rPr>
+          <w:rFonts w:eastAsiaTheme="minorEastAsia"/>
+        </w:rPr>
+        <w:t xml:space="preserve"> and each sensor should be on a new line.</w:t>
       </w:r>
     </w:p>
     <w:p>
@@ -818,7 +944,21 @@
         <w:rPr>
           <w:rFonts w:eastAsiaTheme="minorEastAsia"/>
         </w:rPr>
-        <w:t>For instance, 1,AEW6-1 shows the animal ID on sensor 1.</w:t>
+        <w:t xml:space="preserve">For instance, </w:t>
+      </w:r>
+      <w:proofErr w:type="gramStart"/>
+      <w:r>
+        <w:rPr>
+          <w:rFonts w:eastAsiaTheme="minorEastAsia"/>
+        </w:rPr>
+        <w:t>1,AEW</w:t>
+      </w:r>
+      <w:proofErr w:type="gramEnd"/>
+      <w:r>
+        <w:rPr>
+          <w:rFonts w:eastAsiaTheme="minorEastAsia"/>
+        </w:rPr>
+        <w:t>6-1 shows the animal ID on sensor 1.</w:t>
       </w:r>
     </w:p>
     <w:p>
@@ -837,7 +977,21 @@
         <w:rPr>
           <w:rFonts w:eastAsiaTheme="minorEastAsia"/>
         </w:rPr>
-        <w:t>Ensure the file is saved as csv and drag-and-drop it onto the cage layout upload box in the CLiQR GUI.</w:t>
+        <w:t xml:space="preserve">Ensure the file is saved as csv and drag-and-drop it onto the cage layout upload box in the </w:t>
+      </w:r>
+      <w:proofErr w:type="spellStart"/>
+      <w:r>
+        <w:rPr>
+          <w:rFonts w:eastAsiaTheme="minorEastAsia"/>
+        </w:rPr>
+        <w:t>CLiQR</w:t>
+      </w:r>
+      <w:proofErr w:type="spellEnd"/>
+      <w:r>
+        <w:rPr>
+          <w:rFonts w:eastAsiaTheme="minorEastAsia"/>
+        </w:rPr>
+        <w:t xml:space="preserve"> GUI.</w:t>
       </w:r>
     </w:p>
     <w:p>
@@ -871,7 +1025,7 @@
           <w:noProof/>
         </w:rPr>
         <w:drawing>
-          <wp:inline distT="0" distB="0" distL="0" distR="0" wp14:anchorId="3D77A032" wp14:editId="5949D2F8">
+          <wp:inline distT="0" distB="0" distL="0" distR="0" wp14:anchorId="3D77A032" wp14:editId="6739C29A">
             <wp:extent cx="5943600" cy="1717675"/>
             <wp:effectExtent l="0" t="0" r="0" b="0"/>
             <wp:docPr id="410671349" name="Picture 3" descr="A white and green line&#10;&#10;AI-generated content may be incorrect."/>
@@ -1481,18 +1635,18 @@
           <w:noProof/>
         </w:rPr>
         <w:drawing>
-          <wp:anchor distT="0" distB="0" distL="114300" distR="114300" simplePos="0" relativeHeight="251664384" behindDoc="0" locked="0" layoutInCell="1" allowOverlap="1" wp14:anchorId="13346DE7" wp14:editId="5674C8D7">
+          <wp:anchor distT="0" distB="0" distL="114300" distR="114300" simplePos="0" relativeHeight="251664384" behindDoc="0" locked="0" layoutInCell="1" allowOverlap="1" wp14:anchorId="1E8770D8" wp14:editId="4A16A140">
             <wp:simplePos x="0" y="0"/>
             <wp:positionH relativeFrom="column">
-              <wp:posOffset>-34714</wp:posOffset>
+              <wp:posOffset>847725</wp:posOffset>
             </wp:positionH>
             <wp:positionV relativeFrom="paragraph">
-              <wp:posOffset>402590</wp:posOffset>
+              <wp:posOffset>473075</wp:posOffset>
             </wp:positionV>
-            <wp:extent cx="5943600" cy="2758440"/>
-            <wp:effectExtent l="0" t="0" r="0" b="0"/>
+            <wp:extent cx="4495800" cy="5000625"/>
+            <wp:effectExtent l="0" t="0" r="0" b="3175"/>
             <wp:wrapTopAndBottom/>
-            <wp:docPr id="1649957482" name="Picture 4" descr="A screenshot of a computer&#10;&#10;AI-generated content may be incorrect."/>
+            <wp:docPr id="1045116431" name="Picture 3"/>
             <wp:cNvGraphicFramePr>
               <a:graphicFrameLocks xmlns:a="http://schemas.openxmlformats.org/drawingml/2006/main" noChangeAspect="1"/>
             </wp:cNvGraphicFramePr>
@@ -1500,29 +1654,38 @@
               <a:graphicData uri="http://schemas.openxmlformats.org/drawingml/2006/picture">
                 <pic:pic xmlns:pic="http://schemas.openxmlformats.org/drawingml/2006/picture">
                   <pic:nvPicPr>
-                    <pic:cNvPr id="1649957482" name="Picture 4" descr="A screenshot of a computer&#10;&#10;AI-generated content may be incorrect."/>
+                    <pic:cNvPr id="1045116431" name="Picture 1045116431"/>
                     <pic:cNvPicPr/>
                   </pic:nvPicPr>
-                  <pic:blipFill>
-                    <a:blip r:embed="rId11" cstate="print">
+                  <pic:blipFill rotWithShape="1">
+                    <a:blip r:embed="rId11">
                       <a:extLst>
                         <a:ext uri="{28A0092B-C50C-407E-A947-70E740481C1C}">
                           <a14:useLocalDpi xmlns:a14="http://schemas.microsoft.com/office/drawing/2010/main" val="0"/>
                         </a:ext>
                       </a:extLst>
                     </a:blip>
+                    <a:srcRect l="4166" t="10100" r="20193" b="1526"/>
                     <a:stretch>
                       <a:fillRect/>
                     </a:stretch>
                   </pic:blipFill>
-                  <pic:spPr>
+                  <pic:spPr bwMode="auto">
                     <a:xfrm>
                       <a:off x="0" y="0"/>
-                      <a:ext cx="5943600" cy="2758440"/>
+                      <a:ext cx="4495800" cy="5000625"/>
                     </a:xfrm>
                     <a:prstGeom prst="rect">
                       <a:avLst/>
                     </a:prstGeom>
+                    <a:ln>
+                      <a:noFill/>
+                    </a:ln>
+                    <a:extLst>
+                      <a:ext uri="{53640926-AAD7-44D8-BBD7-CCE9431645EC}">
+                        <a14:shadowObscured xmlns:a14="http://schemas.microsoft.com/office/drawing/2010/main"/>
+                      </a:ext>
+                    </a:extLst>
                   </pic:spPr>
                 </pic:pic>
               </a:graphicData>
@@ -1739,22 +1902,21 @@
       </w:pPr>
       <w:r>
         <w:rPr>
-          <w:rFonts w:eastAsiaTheme="minorEastAsia"/>
           <w:noProof/>
         </w:rPr>
         <w:drawing>
-          <wp:anchor distT="0" distB="0" distL="114300" distR="114300" simplePos="0" relativeHeight="251659264" behindDoc="0" locked="0" layoutInCell="1" allowOverlap="1" wp14:anchorId="4050DA6E" wp14:editId="78D88B78">
+          <wp:anchor distT="0" distB="0" distL="114300" distR="114300" simplePos="0" relativeHeight="251665408" behindDoc="0" locked="0" layoutInCell="1" allowOverlap="1" wp14:anchorId="5EC7B6C5" wp14:editId="07B6123F">
             <wp:simplePos x="0" y="0"/>
             <wp:positionH relativeFrom="column">
-              <wp:posOffset>33866</wp:posOffset>
+              <wp:posOffset>561975</wp:posOffset>
             </wp:positionH>
             <wp:positionV relativeFrom="paragraph">
-              <wp:posOffset>406400</wp:posOffset>
+              <wp:posOffset>398145</wp:posOffset>
             </wp:positionV>
-            <wp:extent cx="5943600" cy="3971925"/>
-            <wp:effectExtent l="0" t="0" r="0" b="3175"/>
+            <wp:extent cx="4981575" cy="4458335"/>
+            <wp:effectExtent l="0" t="0" r="0" b="0"/>
             <wp:wrapTopAndBottom/>
-            <wp:docPr id="1313068861" name="Picture 5" descr="A screen shot of a computer screen&#10;&#10;AI-generated content may be incorrect."/>
+            <wp:docPr id="2052245460" name="Picture 4"/>
             <wp:cNvGraphicFramePr>
               <a:graphicFrameLocks xmlns:a="http://schemas.openxmlformats.org/drawingml/2006/main" noChangeAspect="1"/>
             </wp:cNvGraphicFramePr>
@@ -1762,10 +1924,10 @@
               <a:graphicData uri="http://schemas.openxmlformats.org/drawingml/2006/picture">
                 <pic:pic xmlns:pic="http://schemas.openxmlformats.org/drawingml/2006/picture">
                   <pic:nvPicPr>
-                    <pic:cNvPr id="1313068861" name="Picture 5" descr="A screen shot of a computer screen&#10;&#10;AI-generated content may be incorrect."/>
+                    <pic:cNvPr id="2052245460" name="Picture 2052245460"/>
                     <pic:cNvPicPr/>
                   </pic:nvPicPr>
-                  <pic:blipFill>
+                  <pic:blipFill rotWithShape="1">
                     <a:blip r:embed="rId13">
                       <a:extLst>
                         <a:ext uri="{28A0092B-C50C-407E-A947-70E740481C1C}">
@@ -1773,18 +1935,27 @@
                         </a:ext>
                       </a:extLst>
                     </a:blip>
+                    <a:srcRect l="2244" t="21210" r="13941"/>
                     <a:stretch>
                       <a:fillRect/>
                     </a:stretch>
                   </pic:blipFill>
-                  <pic:spPr>
+                  <pic:spPr bwMode="auto">
                     <a:xfrm>
                       <a:off x="0" y="0"/>
-                      <a:ext cx="5943600" cy="3971925"/>
+                      <a:ext cx="4981575" cy="4458335"/>
                     </a:xfrm>
                     <a:prstGeom prst="rect">
                       <a:avLst/>
                     </a:prstGeom>
+                    <a:ln>
+                      <a:noFill/>
+                    </a:ln>
+                    <a:extLst>
+                      <a:ext uri="{53640926-AAD7-44D8-BBD7-CCE9431645EC}">
+                        <a14:shadowObscured xmlns:a14="http://schemas.microsoft.com/office/drawing/2010/main"/>
+                      </a:ext>
+                    </a:extLst>
                   </pic:spPr>
                 </pic:pic>
               </a:graphicData>
@@ -1857,19 +2028,7 @@
         <w:rPr>
           <w:rFonts w:eastAsiaTheme="minorEastAsia"/>
         </w:rPr>
-        <w:t xml:space="preserve">The signal should start </w:t>
-      </w:r>
-      <w:r>
-        <w:rPr>
-          <w:rFonts w:eastAsiaTheme="minorEastAsia"/>
-        </w:rPr>
-        <w:t>at or above</w:t>
-      </w:r>
-      <w:r>
-        <w:rPr>
-          <w:rFonts w:eastAsiaTheme="minorEastAsia"/>
-        </w:rPr>
-        <w:t xml:space="preserve"> 165 pF and drop to 80 pF or lower</w:t>
+        <w:t>You should be able to clearly distinguish all three finger presses</w:t>
       </w:r>
     </w:p>
     <w:p>
@@ -1888,25 +2047,6 @@
         <w:rPr>
           <w:rFonts w:eastAsiaTheme="minorEastAsia"/>
         </w:rPr>
-        <w:t>You should be able to clearly distinguish all three finger presses</w:t>
-      </w:r>
-    </w:p>
-    <w:p>
-      <w:pPr>
-        <w:pStyle w:val="ListParagraph"/>
-        <w:numPr>
-          <w:ilvl w:val="2"/>
-          <w:numId w:val="1"/>
-        </w:numPr>
-        <w:spacing w:line="259" w:lineRule="auto"/>
-        <w:rPr>
-          <w:rFonts w:eastAsiaTheme="minorEastAsia"/>
-        </w:rPr>
-      </w:pPr>
-      <w:r>
-        <w:rPr>
-          <w:rFonts w:eastAsiaTheme="minorEastAsia"/>
-        </w:rPr>
         <w:t>If the signal isn’t good, there are a couple of things to try:</w:t>
       </w:r>
     </w:p>
@@ -1926,7 +2066,19 @@
         <w:rPr>
           <w:rFonts w:eastAsiaTheme="minorEastAsia"/>
         </w:rPr>
-        <w:t>Adjust the sipper holder to ensure that the copper tape is making firm contact with the ring</w:t>
+        <w:t xml:space="preserve">Use a small amount of alcohol to wipe the copper tape </w:t>
+      </w:r>
+      <w:r>
+        <w:rPr>
+          <w:rFonts w:eastAsiaTheme="minorEastAsia"/>
+        </w:rPr>
+        <w:t>of the sipper holder and the sipper tip where it meets the holder</w:t>
+      </w:r>
+      <w:r>
+        <w:rPr>
+          <w:rFonts w:eastAsiaTheme="minorEastAsia"/>
+        </w:rPr>
+        <w:t xml:space="preserve"> (dirtiness can degrade the signal)</w:t>
       </w:r>
     </w:p>
     <w:p>
@@ -1945,26 +2097,21 @@
         <w:rPr>
           <w:rFonts w:eastAsiaTheme="minorEastAsia"/>
         </w:rPr>
-        <w:t>Use a small amount of alcohol to wipe the copper tape and metal ring (dirtiness can degrade the signal)</w:t>
-      </w:r>
-    </w:p>
-    <w:p>
-      <w:pPr>
-        <w:pStyle w:val="ListParagraph"/>
-        <w:numPr>
-          <w:ilvl w:val="3"/>
-          <w:numId w:val="1"/>
-        </w:numPr>
-        <w:spacing w:line="259" w:lineRule="auto"/>
-        <w:rPr>
-          <w:rFonts w:eastAsiaTheme="minorEastAsia"/>
-        </w:rPr>
-      </w:pPr>
-      <w:r>
-        <w:rPr>
-          <w:rFonts w:eastAsiaTheme="minorEastAsia"/>
-        </w:rPr>
-        <w:t>If you cannot get the signal to look good through fiddling, make a note of which sensor/animal in the comments box at the bottom of the CLiQR GUI and move on</w:t>
+        <w:t xml:space="preserve">If you cannot get the signal to look good through fiddling, make a note of which sensor/animal in the comments box at the bottom of the </w:t>
+      </w:r>
+      <w:proofErr w:type="spellStart"/>
+      <w:r>
+        <w:rPr>
+          <w:rFonts w:eastAsiaTheme="minorEastAsia"/>
+        </w:rPr>
+        <w:t>CLiQR</w:t>
+      </w:r>
+      <w:proofErr w:type="spellEnd"/>
+      <w:r>
+        <w:rPr>
+          <w:rFonts w:eastAsiaTheme="minorEastAsia"/>
+        </w:rPr>
+        <w:t xml:space="preserve"> GUI and move on</w:t>
       </w:r>
     </w:p>
     <w:p>
@@ -2016,14 +2163,20 @@
         <w:rPr>
           <w:rFonts w:eastAsiaTheme="minorEastAsia"/>
         </w:rPr>
-        <w:t xml:space="preserve">. The volume should be read by the same person each time, both when starting and stopping a run, to minimize inter-person variability of readings. The </w:t>
+        <w:t xml:space="preserve">. The volume should be read by the same person each time, both when starting </w:t>
       </w:r>
       <w:r>
         <w:rPr>
           <w:rFonts w:eastAsiaTheme="minorEastAsia"/>
         </w:rPr>
         <w:lastRenderedPageBreak/>
-        <w:t>sippers should typically be filled to around 10 mL, but the change in volume between starting and stopping volumes is much more important than the absolute starting point (a start reading of 2 mL and stop at 1.9 mL will give the same results as a start at 10 mL and stop at 9.9 mL in our analysis).</w:t>
+        <w:t>and stopping a run, to minimize inter-person variability of readings. The sippers should typically be filled to around 10 mL, but the change in volume between starting and stopping volumes is much more important than the absolute starting point (a start reading of 2 mL and stop at 1.9 mL will give the same results as a start at 10 mL and stop at 9.9 mL in our analysis).</w:t>
+      </w:r>
+      <w:r>
+        <w:rPr>
+          <w:rFonts w:eastAsiaTheme="minorEastAsia"/>
+        </w:rPr>
+        <w:t xml:space="preserve"> Ensure that volumes are read to the nearest 0.05 mL (the best resolution we can read with graduation markings at 0.1 mL intervals).</w:t>
       </w:r>
     </w:p>
     <w:p>
@@ -2035,6 +2188,7 @@
           <w:rFonts w:eastAsiaTheme="minorEastAsia"/>
           <w:noProof/>
         </w:rPr>
+        <w:lastRenderedPageBreak/>
         <w:drawing>
           <wp:inline distT="0" distB="0" distL="0" distR="0" wp14:anchorId="266B6ECF" wp14:editId="0286CA8D">
             <wp:extent cx="5562598" cy="6883121"/>
@@ -2088,8 +2242,29 @@
         </w:rPr>
       </w:pPr>
       <w:r>
-        <w:t>Figure S26. This sipper would be read as 8.8 mL. It’s difficult to see here, but there are alternative labels: 0 = 10, 1 = 9, 2 = 8, etc. So we read this as 1.2 mL below 10 = 8.8 mL.</w:t>
-      </w:r>
+        <w:t xml:space="preserve">Figure S26. This sipper would be read as 8.8 </w:t>
+      </w:r>
+      <w:proofErr w:type="spellStart"/>
+      <w:r>
+        <w:t>mL.</w:t>
+      </w:r>
+      <w:proofErr w:type="spellEnd"/>
+      <w:r>
+        <w:t xml:space="preserve"> It’s difficult to see here, but there are alternative labels: 0 = 10, 1 = 9, 2 = 8, etc. </w:t>
+      </w:r>
+      <w:proofErr w:type="gramStart"/>
+      <w:r>
+        <w:t>So</w:t>
+      </w:r>
+      <w:proofErr w:type="gramEnd"/>
+      <w:r>
+        <w:t xml:space="preserve"> we read this as 1.2 mL below 10 = 8.8 </w:t>
+      </w:r>
+      <w:proofErr w:type="spellStart"/>
+      <w:r>
+        <w:t>mL.</w:t>
+      </w:r>
+      <w:proofErr w:type="spellEnd"/>
     </w:p>
     <w:p>
       <w:pPr>
@@ -2107,21 +2282,56 @@
         <w:rPr>
           <w:rFonts w:eastAsiaTheme="minorEastAsia"/>
         </w:rPr>
+        <w:t xml:space="preserve">Once </w:t>
+      </w:r>
+      <w:r>
+        <w:rPr>
+          <w:rFonts w:eastAsiaTheme="minorEastAsia"/>
+        </w:rPr>
+        <w:t>you have completed the above steps</w:t>
+      </w:r>
+      <w:r>
+        <w:rPr>
+          <w:rFonts w:eastAsiaTheme="minorEastAsia"/>
+        </w:rPr>
+        <w:t>, set a timer for 2 hours</w:t>
+      </w:r>
+    </w:p>
+    <w:p>
+      <w:pPr>
+        <w:pStyle w:val="ListParagraph"/>
+        <w:numPr>
+          <w:ilvl w:val="0"/>
+          <w:numId w:val="1"/>
+        </w:numPr>
+        <w:spacing w:line="259" w:lineRule="auto"/>
+        <w:rPr>
+          <w:rFonts w:eastAsiaTheme="minorEastAsia"/>
+        </w:rPr>
+      </w:pPr>
+      <w:r>
+        <w:rPr>
+          <w:rFonts w:eastAsiaTheme="minorEastAsia"/>
+        </w:rPr>
+        <w:t>Place the “Experiment in Progress” sign on the rack</w:t>
+      </w:r>
+    </w:p>
+    <w:p>
+      <w:pPr>
+        <w:pStyle w:val="Heading2"/>
+        <w:rPr>
+          <w:rFonts w:eastAsiaTheme="minorEastAsia"/>
+        </w:rPr>
+      </w:pPr>
+      <w:bookmarkStart w:id="3" w:name="_Toc222400676"/>
+      <w:r>
+        <w:rPr>
+          <w:rFonts w:eastAsiaTheme="minorEastAsia"/>
+        </w:rPr>
         <w:lastRenderedPageBreak/>
-        <w:t xml:space="preserve">Once </w:t>
-      </w:r>
-      <w:r>
-        <w:rPr>
-          <w:rFonts w:eastAsiaTheme="minorEastAsia"/>
-        </w:rPr>
-        <w:t>you have completed the above steps</w:t>
-      </w:r>
-      <w:r>
-        <w:rPr>
-          <w:rFonts w:eastAsiaTheme="minorEastAsia"/>
-        </w:rPr>
-        <w:t>, set a timer for 2 hours</w:t>
-      </w:r>
+        <w:t>Ending a Session</w:t>
+      </w:r>
+      <w:bookmarkEnd w:id="3"/>
     </w:p>
     <w:p>
       <w:pPr>
@@ -2139,24 +2349,8 @@
         <w:rPr>
           <w:rFonts w:eastAsiaTheme="minorEastAsia"/>
         </w:rPr>
-        <w:t>Place the “Experiment in Progress” sign on the rack</w:t>
-      </w:r>
-    </w:p>
-    <w:p>
-      <w:pPr>
-        <w:pStyle w:val="Heading2"/>
-        <w:rPr>
-          <w:rFonts w:eastAsiaTheme="minorEastAsia"/>
-        </w:rPr>
-      </w:pPr>
-      <w:bookmarkStart w:id="3" w:name="_Toc222400676"/>
-      <w:r>
-        <w:rPr>
-          <w:rFonts w:eastAsiaTheme="minorEastAsia"/>
-        </w:rPr>
-        <w:t>Ending a Session</w:t>
-      </w:r>
-      <w:bookmarkEnd w:id="3"/>
+        <w:t>Wait outside vivarium until the 2 hours are complete</w:t>
+      </w:r>
     </w:p>
     <w:p>
       <w:pPr>
@@ -2174,7 +2368,7 @@
         <w:rPr>
           <w:rFonts w:eastAsiaTheme="minorEastAsia"/>
         </w:rPr>
-        <w:t>Wait outside vivarium until the 2 hours are complete</w:t>
+        <w:t>Take “Experiment in Progress” sign down</w:t>
       </w:r>
     </w:p>
     <w:p>
@@ -2193,7 +2387,121 @@
         <w:rPr>
           <w:rFonts w:eastAsiaTheme="minorEastAsia"/>
         </w:rPr>
-        <w:t>Take “Experiment in Progress” sign down</w:t>
+        <w:t>Starting with sensor 1 again:</w:t>
+      </w:r>
+    </w:p>
+    <w:p>
+      <w:pPr>
+        <w:pStyle w:val="ListParagraph"/>
+        <w:numPr>
+          <w:ilvl w:val="1"/>
+          <w:numId w:val="1"/>
+        </w:numPr>
+        <w:spacing w:line="259" w:lineRule="auto"/>
+        <w:rPr>
+          <w:rFonts w:eastAsiaTheme="minorEastAsia"/>
+        </w:rPr>
+      </w:pPr>
+      <w:r>
+        <w:rPr>
+          <w:rFonts w:eastAsiaTheme="minorEastAsia"/>
+        </w:rPr>
+        <w:t>Press the “Stop” button corresponding to the correct sensor</w:t>
+      </w:r>
+    </w:p>
+    <w:p>
+      <w:pPr>
+        <w:pStyle w:val="ListParagraph"/>
+        <w:numPr>
+          <w:ilvl w:val="1"/>
+          <w:numId w:val="1"/>
+        </w:numPr>
+        <w:spacing w:line="259" w:lineRule="auto"/>
+        <w:rPr>
+          <w:rFonts w:eastAsiaTheme="minorEastAsia"/>
+        </w:rPr>
+      </w:pPr>
+      <w:r>
+        <w:rPr>
+          <w:rFonts w:eastAsiaTheme="minorEastAsia"/>
+        </w:rPr>
+        <w:t>Read and record the volume of liquid remaining in the sipper in the “Stop Vol” input box</w:t>
+      </w:r>
+    </w:p>
+    <w:p>
+      <w:pPr>
+        <w:pStyle w:val="ListParagraph"/>
+        <w:numPr>
+          <w:ilvl w:val="1"/>
+          <w:numId w:val="1"/>
+        </w:numPr>
+        <w:spacing w:line="259" w:lineRule="auto"/>
+        <w:rPr>
+          <w:rFonts w:eastAsiaTheme="minorEastAsia"/>
+        </w:rPr>
+      </w:pPr>
+      <w:r>
+        <w:rPr>
+          <w:rFonts w:eastAsiaTheme="minorEastAsia"/>
+        </w:rPr>
+        <w:t>Carefully remove the sipper from the sipper holder and set aside</w:t>
+      </w:r>
+    </w:p>
+    <w:p>
+      <w:pPr>
+        <w:pStyle w:val="ListParagraph"/>
+        <w:numPr>
+          <w:ilvl w:val="1"/>
+          <w:numId w:val="1"/>
+        </w:numPr>
+        <w:spacing w:line="259" w:lineRule="auto"/>
+        <w:rPr>
+          <w:rFonts w:eastAsiaTheme="minorEastAsia"/>
+        </w:rPr>
+      </w:pPr>
+      <w:r>
+        <w:rPr>
+          <w:rFonts w:eastAsiaTheme="minorEastAsia"/>
+        </w:rPr>
+        <w:t>Remove the sipper holder from the cage lid and place it on the rack beside the cage</w:t>
+      </w:r>
+    </w:p>
+    <w:p>
+      <w:pPr>
+        <w:pStyle w:val="ListParagraph"/>
+        <w:numPr>
+          <w:ilvl w:val="1"/>
+          <w:numId w:val="1"/>
+        </w:numPr>
+        <w:spacing w:line="259" w:lineRule="auto"/>
+        <w:rPr>
+          <w:rFonts w:eastAsiaTheme="minorEastAsia"/>
+        </w:rPr>
+      </w:pPr>
+      <w:r>
+        <w:rPr>
+          <w:rFonts w:eastAsiaTheme="minorEastAsia"/>
+        </w:rPr>
+        <w:t>Replace the large water bottle</w:t>
+      </w:r>
+    </w:p>
+    <w:p>
+      <w:pPr>
+        <w:pStyle w:val="ListParagraph"/>
+        <w:numPr>
+          <w:ilvl w:val="1"/>
+          <w:numId w:val="1"/>
+        </w:numPr>
+        <w:spacing w:line="259" w:lineRule="auto"/>
+        <w:rPr>
+          <w:rFonts w:eastAsiaTheme="minorEastAsia"/>
+        </w:rPr>
+      </w:pPr>
+      <w:r>
+        <w:rPr>
+          <w:rFonts w:eastAsiaTheme="minorEastAsia"/>
+        </w:rPr>
+        <w:t>Transfer the cage back to the other rack</w:t>
       </w:r>
     </w:p>
     <w:p>
@@ -2212,7 +2520,40 @@
         <w:rPr>
           <w:rFonts w:eastAsiaTheme="minorEastAsia"/>
         </w:rPr>
-        <w:t>Starting with sensor 1 again:</w:t>
+        <w:t>Once you’ve stopped the sensors, press the large “Stop Recording” button to finalize the data files</w:t>
+      </w:r>
+    </w:p>
+    <w:p>
+      <w:pPr>
+        <w:pStyle w:val="ListParagraph"/>
+        <w:numPr>
+          <w:ilvl w:val="0"/>
+          <w:numId w:val="1"/>
+        </w:numPr>
+        <w:spacing w:line="259" w:lineRule="auto"/>
+        <w:rPr>
+          <w:rFonts w:eastAsiaTheme="minorEastAsia"/>
+        </w:rPr>
+      </w:pPr>
+      <w:r>
+        <w:rPr>
+          <w:rFonts w:eastAsiaTheme="minorEastAsia"/>
+        </w:rPr>
+        <w:t xml:space="preserve">The data has been saved in the directory you selected for the “Output Directory”, which defaults to </w:t>
+      </w:r>
+      <w:proofErr w:type="spellStart"/>
+      <w:r>
+        <w:rPr>
+          <w:rFonts w:eastAsiaTheme="minorEastAsia"/>
+        </w:rPr>
+        <w:t>CLiQR</w:t>
+      </w:r>
+      <w:proofErr w:type="spellEnd"/>
+      <w:r>
+        <w:rPr>
+          <w:rFonts w:eastAsiaTheme="minorEastAsia"/>
+        </w:rPr>
+        <w:t>\Lickometry Data\</w:t>
       </w:r>
     </w:p>
     <w:p>
@@ -2227,163 +2568,27 @@
           <w:rFonts w:eastAsiaTheme="minorEastAsia"/>
         </w:rPr>
       </w:pPr>
-      <w:r>
-        <w:rPr>
-          <w:rFonts w:eastAsiaTheme="minorEastAsia"/>
-        </w:rPr>
-        <w:t>Press the “Stop” button corresponding to the correct sensor</w:t>
-      </w:r>
-    </w:p>
-    <w:p>
-      <w:pPr>
-        <w:pStyle w:val="ListParagraph"/>
-        <w:numPr>
-          <w:ilvl w:val="1"/>
-          <w:numId w:val="1"/>
-        </w:numPr>
-        <w:spacing w:line="259" w:lineRule="auto"/>
-        <w:rPr>
-          <w:rFonts w:eastAsiaTheme="minorEastAsia"/>
-        </w:rPr>
-      </w:pPr>
-      <w:r>
-        <w:rPr>
-          <w:rFonts w:eastAsiaTheme="minorEastAsia"/>
-        </w:rPr>
-        <w:t>Read and record the volume of liquid remaining in the sipper in the “Stop Vol” input box</w:t>
-      </w:r>
-    </w:p>
-    <w:p>
-      <w:pPr>
-        <w:pStyle w:val="ListParagraph"/>
-        <w:numPr>
-          <w:ilvl w:val="1"/>
-          <w:numId w:val="1"/>
-        </w:numPr>
-        <w:spacing w:line="259" w:lineRule="auto"/>
-        <w:rPr>
-          <w:rFonts w:eastAsiaTheme="minorEastAsia"/>
-        </w:rPr>
-      </w:pPr>
-      <w:r>
-        <w:rPr>
-          <w:rFonts w:eastAsiaTheme="minorEastAsia"/>
-        </w:rPr>
-        <w:t>Carefully remove the sipper from the sipper holder and set aside</w:t>
-      </w:r>
-    </w:p>
-    <w:p>
-      <w:pPr>
-        <w:pStyle w:val="ListParagraph"/>
-        <w:numPr>
-          <w:ilvl w:val="1"/>
-          <w:numId w:val="1"/>
-        </w:numPr>
-        <w:spacing w:line="259" w:lineRule="auto"/>
-        <w:rPr>
-          <w:rFonts w:eastAsiaTheme="minorEastAsia"/>
-        </w:rPr>
-      </w:pPr>
-      <w:r>
-        <w:rPr>
-          <w:rFonts w:eastAsiaTheme="minorEastAsia"/>
-        </w:rPr>
-        <w:t>Remove the sipper holder from the cage lid and place it on the rack beside the cage</w:t>
-      </w:r>
-    </w:p>
-    <w:p>
-      <w:pPr>
-        <w:pStyle w:val="ListParagraph"/>
-        <w:numPr>
-          <w:ilvl w:val="1"/>
-          <w:numId w:val="1"/>
-        </w:numPr>
-        <w:spacing w:line="259" w:lineRule="auto"/>
-        <w:rPr>
-          <w:rFonts w:eastAsiaTheme="minorEastAsia"/>
-        </w:rPr>
-      </w:pPr>
-      <w:r>
-        <w:rPr>
-          <w:rFonts w:eastAsiaTheme="minorEastAsia"/>
-        </w:rPr>
-        <w:t>Replace the large water bottle</w:t>
-      </w:r>
-    </w:p>
-    <w:p>
-      <w:pPr>
-        <w:pStyle w:val="ListParagraph"/>
-        <w:numPr>
-          <w:ilvl w:val="1"/>
-          <w:numId w:val="1"/>
-        </w:numPr>
-        <w:spacing w:line="259" w:lineRule="auto"/>
-        <w:rPr>
-          <w:rFonts w:eastAsiaTheme="minorEastAsia"/>
-        </w:rPr>
-      </w:pPr>
-      <w:r>
-        <w:rPr>
-          <w:rFonts w:eastAsiaTheme="minorEastAsia"/>
-        </w:rPr>
-        <w:t>Transfer the cage back to the other rack</w:t>
-      </w:r>
-    </w:p>
-    <w:p>
-      <w:pPr>
-        <w:pStyle w:val="ListParagraph"/>
-        <w:numPr>
-          <w:ilvl w:val="0"/>
-          <w:numId w:val="1"/>
-        </w:numPr>
-        <w:spacing w:line="259" w:lineRule="auto"/>
-        <w:rPr>
-          <w:rFonts w:eastAsiaTheme="minorEastAsia"/>
-        </w:rPr>
-      </w:pPr>
-      <w:r>
-        <w:rPr>
-          <w:rFonts w:eastAsiaTheme="minorEastAsia"/>
-        </w:rPr>
-        <w:t>Once you’ve stopped the sensors, press the large “Stop Recording” button to finalize the data files</w:t>
-      </w:r>
-    </w:p>
-    <w:p>
-      <w:pPr>
-        <w:pStyle w:val="ListParagraph"/>
-        <w:numPr>
-          <w:ilvl w:val="0"/>
-          <w:numId w:val="1"/>
-        </w:numPr>
-        <w:spacing w:line="259" w:lineRule="auto"/>
-        <w:rPr>
-          <w:rFonts w:eastAsiaTheme="minorEastAsia"/>
-        </w:rPr>
-      </w:pPr>
-      <w:r>
-        <w:rPr>
-          <w:rFonts w:eastAsiaTheme="minorEastAsia"/>
-        </w:rPr>
-        <w:t>The data has been saved in the directory you selected for the “Output Directory”, which defaults to C:\Users\TimmeLab\CLiQR\Lickometry Data\</w:t>
-      </w:r>
-    </w:p>
-    <w:p>
-      <w:pPr>
-        <w:pStyle w:val="ListParagraph"/>
-        <w:numPr>
-          <w:ilvl w:val="1"/>
-          <w:numId w:val="1"/>
-        </w:numPr>
-        <w:spacing w:line="259" w:lineRule="auto"/>
-        <w:rPr>
-          <w:rFonts w:eastAsiaTheme="minorEastAsia"/>
-        </w:rPr>
-      </w:pPr>
-      <w:r>
-        <w:rPr>
-          <w:rFonts w:eastAsiaTheme="minorEastAsia"/>
-        </w:rPr>
-        <w:t>raw_data_{date of recording}.h5</w:t>
+      <w:proofErr w:type="spellStart"/>
+      <w:r>
+        <w:rPr>
+          <w:rFonts w:eastAsiaTheme="minorEastAsia"/>
+        </w:rPr>
+        <w:t>raw_data</w:t>
+      </w:r>
+      <w:proofErr w:type="spellEnd"/>
+      <w:proofErr w:type="gramStart"/>
+      <w:r>
+        <w:rPr>
+          <w:rFonts w:eastAsiaTheme="minorEastAsia"/>
+        </w:rPr>
+        <w:t>_{</w:t>
+      </w:r>
+      <w:proofErr w:type="gramEnd"/>
+      <w:r>
+        <w:rPr>
+          <w:rFonts w:eastAsiaTheme="minorEastAsia"/>
+        </w:rPr>
+        <w:t>date of recording}.h5</w:t>
       </w:r>
     </w:p>
     <w:p>
@@ -2604,7 +2809,15 @@
         </w:rPr>
       </w:pPr>
       <w:r>
-        <w:t>Figure S27. Activity log (for debugging) and comments section are found at the very bottom of the CLiQR GUI window.</w:t>
+        <w:t xml:space="preserve">Figure S27. Activity log (for debugging) and comments section are found at the very bottom of the </w:t>
+      </w:r>
+      <w:proofErr w:type="spellStart"/>
+      <w:r>
+        <w:t>CLiQR</w:t>
+      </w:r>
+      <w:proofErr w:type="spellEnd"/>
+      <w:r>
+        <w:t xml:space="preserve"> GUI window.</w:t>
       </w:r>
     </w:p>
     <w:p/>
@@ -2620,7 +2833,7 @@
 </file>
 
 <file path=word/numbering.xml><?xml version="1.0" encoding="utf-8"?>
-<w:numbering xmlns:wpc="http://schemas.microsoft.com/office/word/2010/wordprocessingCanvas" xmlns:cx="http://schemas.microsoft.com/office/drawing/2014/chartex" xmlns:cx1="http://schemas.microsoft.com/office/drawing/2015/9/8/chartex" xmlns:cx2="http://schemas.microsoft.com/office/drawing/2015/10/21/chartex" xmlns:cx3="http://schemas.microsoft.com/office/drawing/2016/5/9/chartex" xmlns:cx4="http://schemas.microsoft.com/office/drawing/2016/5/10/chartex" xmlns:cx5="http://schemas.microsoft.com/office/drawing/2016/5/11/chartex" xmlns:cx6="http://schemas.microsoft.com/office/drawing/2016/5/12/chartex" xmlns:cx7="http://schemas.microsoft.com/office/drawing/2016/5/13/chartex" xmlns:cx8="http://schemas.microsoft.com/office/drawing/2016/5/14/chartex" xmlns:mc="http://schemas.openxmlformats.org/markup-compatibility/2006" xmlns:aink="http://schemas.microsoft.com/office/drawing/2016/ink" xmlns:am3d="http://schemas.microsoft.com/office/drawing/2017/model3d" xmlns:o="urn:schemas-microsoft-com:office:office" xmlns:oel="http://schemas.microsoft.com/office/2019/extlst" xmlns:r="http://schemas.openxmlformats.org/officeDocument/2006/relationships" xmlns:m="http://schemas.openxmlformats.org/officeDocument/2006/math" xmlns:v="urn:schemas-microsoft-com:vml" xmlns:wp14="http://schemas.microsoft.com/office/word/2010/wordprocessingDrawing" xmlns:wp="http://schemas.openxmlformats.org/drawingml/2006/wordprocessingDrawing" xmlns:w10="urn:schemas-microsoft-com:office:word" xmlns:w="http://schemas.openxmlformats.org/wordprocessingml/2006/main" xmlns:w14="http://schemas.microsoft.com/office/word/2010/wordml" xmlns:w15="http://schemas.microsoft.com/office/word/2012/wordml" xmlns:w16cex="http://schemas.microsoft.com/office/word/2018/wordml/cex" xmlns:w16cid="http://schemas.microsoft.com/office/word/2016/wordml/cid" xmlns:w16="http://schemas.microsoft.com/office/word/2018/wordml" xmlns:w16du="http://schemas.microsoft.com/office/word/2023/wordml/word16du" xmlns:w16sdtdh="http://schemas.microsoft.com/office/word/2020/wordml/sdtdatahash" xmlns:w16sdtfl="http://schemas.microsoft.com/office/word/2024/wordml/sdtformatlock" xmlns:w16se="http://schemas.microsoft.com/office/word/2015/wordml/symex" xmlns:wpg="http://schemas.microsoft.com/office/word/2010/wordprocessingGroup" xmlns:wpi="http://schemas.microsoft.com/office/word/2010/wordprocessingInk" xmlns:wne="http://schemas.microsoft.com/office/word/2006/wordml" xmlns:wps="http://schemas.microsoft.com/office/word/2010/wordprocessingShape" mc:Ignorable="w14 w15 w16se w16cid w16 w16cex w16sdtdh w16sdtfl w16du wp14">
+<w:numbering xmlns:wpc="http://schemas.microsoft.com/office/word/2010/wordprocessingCanvas" xmlns:cx="http://schemas.microsoft.com/office/drawing/2014/chartex" xmlns:cx1="http://schemas.microsoft.com/office/drawing/2015/9/8/chartex" xmlns:cx2="http://schemas.microsoft.com/office/drawing/2015/10/21/chartex" xmlns:cx3="http://schemas.microsoft.com/office/drawing/2016/5/9/chartex" xmlns:cx4="http://schemas.microsoft.com/office/drawing/2016/5/10/chartex" xmlns:cx5="http://schemas.microsoft.com/office/drawing/2016/5/11/chartex" xmlns:cx6="http://schemas.microsoft.com/office/drawing/2016/5/12/chartex" xmlns:cx7="http://schemas.microsoft.com/office/drawing/2016/5/13/chartex" xmlns:cx8="http://schemas.microsoft.com/office/drawing/2016/5/14/chartex" xmlns:mc="http://schemas.openxmlformats.org/markup-compatibility/2006" xmlns:m="http://schemas.openxmlformats.org/officeDocument/2006/math" xmlns:aink="http://schemas.microsoft.com/office/drawing/2016/ink" xmlns:am3d="http://schemas.microsoft.com/office/drawing/2017/model3d" xmlns:oel="http://schemas.microsoft.com/office/2019/extlst" xmlns:r="http://schemas.openxmlformats.org/officeDocument/2006/relationships" xmlns:wp14="http://schemas.microsoft.com/office/word/2010/wordprocessingDrawing" xmlns:wp="http://schemas.openxmlformats.org/drawingml/2006/wordprocessingDrawing" xmlns:wpg="http://schemas.microsoft.com/office/word/2010/wordprocessingGroup" xmlns:wpi="http://schemas.microsoft.com/office/word/2010/wordprocessingInk" xmlns:wps="http://schemas.microsoft.com/office/word/2010/wordprocessingShape" xmlns:o="urn:schemas-microsoft-com:office:office" xmlns:v="urn:schemas-microsoft-com:vml" xmlns:w10="urn:schemas-microsoft-com:office:word" xmlns:w="http://schemas.openxmlformats.org/wordprocessingml/2006/main" xmlns:w14="http://schemas.microsoft.com/office/word/2010/wordml" xmlns:w15="http://schemas.microsoft.com/office/word/2012/wordml" xmlns:w16cei="http://schemas.microsoft.com/office/word/2026/wordml/cei" xmlns:w16cex="http://schemas.microsoft.com/office/word/2018/wordml/cex" xmlns:w16cid="http://schemas.microsoft.com/office/word/2016/wordml/cid" xmlns:w16="http://schemas.microsoft.com/office/word/2018/wordml" xmlns:w16sdtdh="http://schemas.microsoft.com/office/word/2020/wordml/sdtdatahash" xmlns:w16sdtfl="http://schemas.microsoft.com/office/word/2024/wordml/sdtformatlock" xmlns:w16se="http://schemas.microsoft.com/office/word/2015/wordml/symex" xmlns:w16du="http://schemas.microsoft.com/office/word/2023/wordml/word16du" xmlns:wne="http://schemas.microsoft.com/office/word/2006/wordml" mc:Ignorable="w14 w15 w16se w16cid w16 w16cex w16sdtdh w16sdtfl w16du wp14">
   <w:abstractNum w:abstractNumId="0" w15:restartNumberingAfterBreak="0">
     <w:nsid w:val="21044127"/>
     <w:multiLevelType w:val="hybridMultilevel"/>
@@ -2865,7 +3078,7 @@
 </file>
 
 <file path=word/styles.xml><?xml version="1.0" encoding="utf-8"?>
-<w:styles xmlns:mc="http://schemas.openxmlformats.org/markup-compatibility/2006" xmlns:r="http://schemas.openxmlformats.org/officeDocument/2006/relationships" xmlns:w="http://schemas.openxmlformats.org/wordprocessingml/2006/main" xmlns:w14="http://schemas.microsoft.com/office/word/2010/wordml" xmlns:w15="http://schemas.microsoft.com/office/word/2012/wordml" xmlns:w16cex="http://schemas.microsoft.com/office/word/2018/wordml/cex" xmlns:w16cid="http://schemas.microsoft.com/office/word/2016/wordml/cid" xmlns:w16="http://schemas.microsoft.com/office/word/2018/wordml" xmlns:w16du="http://schemas.microsoft.com/office/word/2023/wordml/word16du" xmlns:w16sdtdh="http://schemas.microsoft.com/office/word/2020/wordml/sdtdatahash" xmlns:w16sdtfl="http://schemas.microsoft.com/office/word/2024/wordml/sdtformatlock" xmlns:w16se="http://schemas.microsoft.com/office/word/2015/wordml/symex" mc:Ignorable="w14 w15 w16se w16cid w16 w16cex w16sdtdh w16sdtfl w16du">
+<w:styles xmlns:mc="http://schemas.openxmlformats.org/markup-compatibility/2006" xmlns:r="http://schemas.openxmlformats.org/officeDocument/2006/relationships" xmlns:w="http://schemas.openxmlformats.org/wordprocessingml/2006/main" xmlns:w14="http://schemas.microsoft.com/office/word/2010/wordml" xmlns:w15="http://schemas.microsoft.com/office/word/2012/wordml" xmlns:w16cex="http://schemas.microsoft.com/office/word/2018/wordml/cex" xmlns:w16cid="http://schemas.microsoft.com/office/word/2016/wordml/cid" xmlns:w16="http://schemas.microsoft.com/office/word/2018/wordml" xmlns:w16sdtdh="http://schemas.microsoft.com/office/word/2020/wordml/sdtdatahash" xmlns:w16sdtfl="http://schemas.microsoft.com/office/word/2024/wordml/sdtformatlock" xmlns:w16se="http://schemas.microsoft.com/office/word/2015/wordml/symex" xmlns:w16du="http://schemas.microsoft.com/office/word/2023/wordml/word16du" mc:Ignorable="w14 w15 w16se w16cid w16 w16cex w16sdtdh w16sdtfl w16du">
   <w:docDefaults>
     <w:rPrDefault>
       <w:rPr>

</xml_diff>